<commit_message>
Bomb behaivor + missed text
Bad parachut trows bombs + if you miss normal parachute you get text miss
</commit_message>
<xml_diff>
--- a/Documentatie_Herkansing.docx
+++ b/Documentatie_Herkansing.docx
@@ -47,6 +47,9 @@
     </w:p>
     <w:p>
       <w:r>
+        <w:rPr>
+          <w:noProof/>
+        </w:rPr>
         <w:drawing>
           <wp:inline distT="0" distB="0" distL="0" distR="0" wp14:anchorId="1DBBFCF8" wp14:editId="6A59CFC8">
             <wp:extent cx="5760720" cy="2672715"/>
@@ -162,12 +165,14 @@
         <w:rPr>
           <w:b/>
           <w:bCs/>
+          <w:lang w:val="en-US"/>
         </w:rPr>
       </w:pPr>
       <w:r>
         <w:rPr>
           <w:b/>
           <w:bCs/>
+          <w:lang w:val="en-US"/>
         </w:rPr>
         <w:t>Bronnen</w:t>
       </w:r>
@@ -315,6 +320,28 @@
           <w:lang w:val="en-US"/>
         </w:rPr>
         <w:t xml:space="preserve">   </w:t>
+      </w:r>
+      <w:r>
+        <w:rPr>
+          <w:lang w:val="en-US"/>
+        </w:rPr>
+        <w:br/>
+        <w:t xml:space="preserve">- Bomb: </w:t>
+      </w:r>
+      <w:hyperlink r:id="rId11" w:history="1">
+        <w:r>
+          <w:rPr>
+            <w:rStyle w:val="Hyperlink"/>
+            <w:lang w:val="en-US"/>
+          </w:rPr>
+          <w:t>https://thenounproject.com/browse/icons/term/bomb-pixel/</w:t>
+        </w:r>
+      </w:hyperlink>
+      <w:r>
+        <w:rPr>
+          <w:lang w:val="en-US"/>
+        </w:rPr>
+        <w:t xml:space="preserve"> </w:t>
       </w:r>
     </w:p>
     <w:sectPr>
@@ -1050,6 +1077,7 @@
   <w:style w:type="character" w:default="1" w:styleId="DefaultParagraphFont">
     <w:name w:val="Default Paragraph Font"/>
     <w:uiPriority w:val="1"/>
+    <w:semiHidden/>
     <w:unhideWhenUsed/>
   </w:style>
   <w:style w:type="table" w:default="1" w:styleId="TableNormal">

</xml_diff>

<commit_message>
UI + fixed OnEnable()
Het duurde best lang met OnEnable tot ik vond hoe je script in de project settings prioriteiten kon geven.
</commit_message>
<xml_diff>
--- a/Documentatie_Herkansing.docx
+++ b/Documentatie_Herkansing.docx
@@ -137,7 +137,19 @@
         </w:numPr>
       </w:pPr>
       <w:r>
-        <w:t>(zet ze hier onder lijstje heen met naam dik gedrukt (check eerste documentatie))</w:t>
+        <w:t>De new input system: Het</w:t>
+      </w:r>
+      <w:r>
+        <w:t xml:space="preserve"> zorgt dat het de WASD, Arrow knoppen en dat het via controller werkt. Dit keer ook dat de UI w</w:t>
+      </w:r>
+      <w:r>
+        <w:t xml:space="preserve">erkt en er wordt links </w:t>
+      </w:r>
+      <w:r>
+        <w:t xml:space="preserve">boven </w:t>
+      </w:r>
+      <w:r>
+        <w:t xml:space="preserve">gecommuniceerd welke je nu gebruikt. </w:t>
       </w:r>
     </w:p>
     <w:p>
@@ -160,19 +172,18 @@
         <w:t>(Doe de feedback van leraar gebruiken om hier op te antwoorden omdat dit herkansing is)</w:t>
       </w:r>
     </w:p>
+    <w:p/>
     <w:p>
       <w:pPr>
         <w:rPr>
           <w:b/>
           <w:bCs/>
-          <w:lang w:val="en-US"/>
         </w:rPr>
       </w:pPr>
       <w:r>
         <w:rPr>
           <w:b/>
           <w:bCs/>
-          <w:lang w:val="en-US"/>
         </w:rPr>
         <w:t>Bronnen</w:t>
       </w:r>
@@ -304,6 +315,12 @@
           <w:lang w:val="en-US"/>
         </w:rPr>
         <w:br/>
+      </w:r>
+      <w:r>
+        <w:rPr>
+          <w:lang w:val="en-US"/>
+        </w:rPr>
+        <w:lastRenderedPageBreak/>
         <w:t xml:space="preserve">- Game &amp; watch: </w:t>
       </w:r>
       <w:hyperlink r:id="rId10" w:history="1">
@@ -348,12 +365,121 @@
           <w:lang w:val="en-US"/>
         </w:rPr>
         <w:br/>
-      </w:r>
-      <w:r>
-        <w:rPr>
-          <w:lang w:val="en-US"/>
-        </w:rPr>
-        <w:t>- Heart: Zelf in aseprite snel gedaan.</w:t>
+        <w:t xml:space="preserve">- Heart: </w:t>
+      </w:r>
+      <w:proofErr w:type="spellStart"/>
+      <w:r>
+        <w:rPr>
+          <w:lang w:val="en-US"/>
+        </w:rPr>
+        <w:t>Zelf</w:t>
+      </w:r>
+      <w:proofErr w:type="spellEnd"/>
+      <w:r>
+        <w:rPr>
+          <w:lang w:val="en-US"/>
+        </w:rPr>
+        <w:t xml:space="preserve"> in </w:t>
+      </w:r>
+      <w:proofErr w:type="spellStart"/>
+      <w:r>
+        <w:rPr>
+          <w:lang w:val="en-US"/>
+        </w:rPr>
+        <w:t>aseprite</w:t>
+      </w:r>
+      <w:proofErr w:type="spellEnd"/>
+      <w:r>
+        <w:rPr>
+          <w:lang w:val="en-US"/>
+        </w:rPr>
+        <w:t xml:space="preserve"> </w:t>
+      </w:r>
+      <w:proofErr w:type="spellStart"/>
+      <w:r>
+        <w:rPr>
+          <w:lang w:val="en-US"/>
+        </w:rPr>
+        <w:t>snel</w:t>
+      </w:r>
+      <w:proofErr w:type="spellEnd"/>
+      <w:r>
+        <w:rPr>
+          <w:lang w:val="en-US"/>
+        </w:rPr>
+        <w:t xml:space="preserve"> </w:t>
+      </w:r>
+      <w:proofErr w:type="spellStart"/>
+      <w:r>
+        <w:rPr>
+          <w:lang w:val="en-US"/>
+        </w:rPr>
+        <w:t>gedaan</w:t>
+      </w:r>
+      <w:proofErr w:type="spellEnd"/>
+      <w:r>
+        <w:rPr>
+          <w:lang w:val="en-US"/>
+        </w:rPr>
+        <w:t>.</w:t>
+      </w:r>
+      <w:r>
+        <w:rPr>
+          <w:lang w:val="en-US"/>
+        </w:rPr>
+        <w:br/>
+        <w:t xml:space="preserve">- </w:t>
+      </w:r>
+      <w:proofErr w:type="spellStart"/>
+      <w:r>
+        <w:rPr>
+          <w:lang w:val="en-US"/>
+        </w:rPr>
+        <w:t>Contoller</w:t>
+      </w:r>
+      <w:proofErr w:type="spellEnd"/>
+      <w:r>
+        <w:rPr>
+          <w:lang w:val="en-US"/>
+        </w:rPr>
+        <w:t xml:space="preserve"> icon: </w:t>
+      </w:r>
+      <w:hyperlink r:id="rId12" w:history="1">
+        <w:r>
+          <w:rPr>
+            <w:rStyle w:val="Hyperlink"/>
+            <w:lang w:val="en-US"/>
+          </w:rPr>
+          <w:t>https://www.flaticon.com/free-icon/game-controller_141416</w:t>
+        </w:r>
+      </w:hyperlink>
+      <w:r>
+        <w:rPr>
+          <w:lang w:val="en-US"/>
+        </w:rPr>
+        <w:t xml:space="preserve"> </w:t>
+      </w:r>
+      <w:r>
+        <w:rPr>
+          <w:lang w:val="en-US"/>
+        </w:rPr>
+        <w:br/>
+        <w:t xml:space="preserve">- Keyboard Icon: </w:t>
+      </w:r>
+      <w:hyperlink r:id="rId13" w:history="1">
+        <w:r>
+          <w:rPr>
+            <w:rStyle w:val="Hyperlink"/>
+            <w:lang w:val="en-US"/>
+          </w:rPr>
+          <w:t>https://www.flaticon.com/free-icon/keyboard-and-mouse_5033414?term=keyboard&amp;page=1&amp;position=26&amp;origin=search&amp;related_id=5033414</w:t>
+        </w:r>
+      </w:hyperlink>
+      <w:r>
+        <w:rPr>
+          <w:lang w:val="en-US"/>
+        </w:rPr>
+        <w:t xml:space="preserve"> </w:t>
       </w:r>
     </w:p>
     <w:sectPr>
@@ -1089,7 +1215,6 @@
   <w:style w:type="character" w:default="1" w:styleId="DefaultParagraphFont">
     <w:name w:val="Default Paragraph Font"/>
     <w:uiPriority w:val="1"/>
-    <w:semiHidden/>
     <w:unhideWhenUsed/>
   </w:style>
   <w:style w:type="table" w:default="1" w:styleId="TableNormal">

</xml_diff>